<commit_message>
Bônus bets: ajustes de precisão nos roteiros 1 e 2 e datas da nota do roteiro 4
Co-Authored-By: Claude Opus 5.5 <noreply@anthropic.com>
Claude-Session: https://claude.ai/code/session_01EGrxw11y1RieUGZ6R9XQan
</commit_message>
<xml_diff>
--- a/roteiros/curtos/ROTEIROS_BONUS_BETS_06102026.docx
+++ b/roteiros/curtos/ROTEIROS_BONUS_BETS_06102026.docx
@@ -169,7 +169,7 @@
           <w:sz w:val="24"/>
           <w:szCs w:val="24"/>
         </w:rPr>
-        <w:t xml:space="preserve">O presidente Lula, em dezembro de 2023. A partir daí, o cassino online passou a poder funcionar no Brasil com licença do governo.</w:t>
+        <w:t xml:space="preserve">O presidente Lula, em dezembro de 2023. A partir daí, os cassinos online passaram a fazer parte do mercado regulado, sujeitos à autorização do governo.</w:t>
       </w:r>
     </w:p>
     <w:p>
@@ -436,30 +436,30 @@
           <w:sz w:val="24"/>
           <w:szCs w:val="24"/>
         </w:rPr>
-        <w:t xml:space="preserve">E o Congresso vai aprovar?</w:t>
-      </w:r>
-    </w:p>
-    <w:p>
-      <w:pPr>
-        <w:spacing w:after="90"/>
-      </w:pPr>
-      <w:r>
-        <w:rPr>
-          <w:rFonts w:ascii="Times New Roman" w:cs="Times New Roman" w:eastAsia="Times New Roman" w:hAnsi="Times New Roman"/>
-          <w:b/>
-          <w:bCs/>
-          <w:sz w:val="24"/>
-          <w:szCs w:val="24"/>
-        </w:rPr>
-        <w:t xml:space="preserve">Ryan: </w:t>
-      </w:r>
-      <w:r>
-        <w:rPr>
-          <w:rFonts w:ascii="Times New Roman" w:cs="Times New Roman" w:eastAsia="Times New Roman" w:hAnsi="Times New Roman"/>
-          <w:sz w:val="24"/>
-          <w:szCs w:val="24"/>
-        </w:rPr>
-        <w:t xml:space="preserve">Ainda não se sabe. Líderes do Congresso já falam em mudar o texto, criar um período de transição ou devolver o que as empresas pagaram pelas licenças.</w:t>
+        <w:t xml:space="preserve">E o Congresso vai aprovar desse jeito?</w:t>
+      </w:r>
+    </w:p>
+    <w:p>
+      <w:pPr>
+        <w:spacing w:after="90"/>
+      </w:pPr>
+      <w:r>
+        <w:rPr>
+          <w:rFonts w:ascii="Times New Roman" w:cs="Times New Roman" w:eastAsia="Times New Roman" w:hAnsi="Times New Roman"/>
+          <w:b/>
+          <w:bCs/>
+          <w:sz w:val="24"/>
+          <w:szCs w:val="24"/>
+        </w:rPr>
+        <w:t xml:space="preserve">Ryan: </w:t>
+      </w:r>
+      <w:r>
+        <w:rPr>
+          <w:rFonts w:ascii="Times New Roman" w:cs="Times New Roman" w:eastAsia="Times New Roman" w:hAnsi="Times New Roman"/>
+          <w:sz w:val="24"/>
+          <w:szCs w:val="24"/>
+        </w:rPr>
+        <w:t xml:space="preserve">Ainda não se sabe. Já tem várias emendas querendo mudar o texto, inclusive propostas pra manter as apostas esportivas.</w:t>
       </w:r>
     </w:p>
     <w:p>
@@ -624,7 +624,7 @@
           <w:sz w:val="16"/>
           <w:szCs w:val="16"/>
         </w:rPr>
-        <w:t xml:space="preserve">🟡 Regra geral. ATENÇÃO, TEMA EM MOVIMENTO: conferir no dia da postagem se o STF (Min. Fux, ações da ANJL, IBJR, Abert e clubes) suspendeu a MP ou se o Congresso votou algo; se mudou, ajustar as falas 3 e 4. Base: CF, art. 62, §§ 3º e 7º (eficácia imediata; 60 + 60 dias para conversão, sem contar o recesso); MP 1.394/2026; críticas de Flávio ('manobra eleitoral', 'estelionato eleitoral' e risco de a MP caducar), segundo Times Brasil, Revista Fórum e ND Mais. O vídeo atribui a crítica ao Flávio.</w:t>
+        <w:t xml:space="preserve">🟡 Regra geral. ATENÇÃO, TEMA EM MOVIMENTO: conferir no dia da postagem se o STF (Min. Fux, ações da ANJL, IBJR, Abert e clubes) suspendeu a MP ou se o Congresso votou algo; se mudou, ajustar as falas 3 e 4. Emendas: prazo prorrogado até 13/10/2026; há propostas para preservar as apostas esportivas e concentrar a proibição nos cassinos online. Base: CF, art. 62, §§ 3º e 7º (eficácia imediata; 60 + 60 dias para conversão, sem contar o recesso); MP 1.394/2026; críticas de Flávio ('manobra eleitoral', 'estelionato eleitoral' e risco de a MP caducar), segundo Times Brasil, Revista Fórum e ND Mais. O vídeo atribui a crítica ao Flávio.</w:t>
       </w:r>
     </w:p>
     <w:p>
@@ -1250,7 +1250,7 @@
           <w:sz w:val="16"/>
           <w:szCs w:val="16"/>
         </w:rPr>
-        <w:t xml:space="preserve">🟡 Regra geral. TEMA COM PRAZO: postar o quanto antes (a janela de devolução noticiada vai de 9 a 14/10/2026) e conferir no dia se o cronograma mudou ou se o STF suspendeu a MP. Base: MP 1.394/2026 e cronograma divulgado pela imprensa (bets informam saldos aos bancos em 7 e 8/10; bancos devolvem de 9 a 14/10; a Caixa pode intermediar depois disso; cerca de R$ 1,32 bilhão ainda estava nas plataformas, segundo o Ministério da Fazenda); CDC (responsabilidade do fornecedor); Lei 9.099/1995 (Juizado Especial: até 40 salários mínimos; sem advogado até 20). CONFERIR o cronograma oficial no site do Ministério da Fazenda antes de gravar.</w:t>
+        <w:t xml:space="preserve">🟡 Regra geral. TEMA COM PRAZO: postar o quanto antes (a janela de devolução noticiada vai de 9 a 14/10/2026) e conferir no dia se o cronograma mudou ou se o STF suspendeu a MP. Base: MP 1.394/2026 e cronograma divulgado pela imprensa (bets informam saldos aos bancos em 6 e 7/10, segundo o Ministério da Fazenda; bancos devolvem de 9 a 14/10; a Caixa pode intermediar depois disso; cerca de R$ 1,32 bilhão ainda estava nas plataformas, segundo o Ministério da Fazenda); CDC (responsabilidade do fornecedor); Lei 9.099/1995 (Juizado Especial: até 40 salários mínimos; sem advogado até 20). CONFERIR o cronograma oficial no site do Ministério da Fazenda antes de gravar.</w:t>
       </w:r>
     </w:p>
     <w:p>
@@ -1876,7 +1876,7 @@
           <w:sz w:val="16"/>
           <w:szCs w:val="16"/>
         </w:rPr>
-        <w:t xml:space="preserve">🟡 Regra geral. Base: CLT, art. 482, 'l' (prática constante de jogos de azar), 'e' (desídia) e 'h' (indisciplina); CID-11 da OMS (6C50, transtorno do jogo); TST sem entendimento consolidado sobre bets e ludopatia, segundo a imprensa (InfoMoney, Migalhas, Conjur). Ressalva: há debate se aposta regulamentada se enquadra como 'jogo de azar' e se a conduta fora do trabalho basta; o vídeo fala em 'dependendo do caso'. Atendimento: CAPS (Rede de Atenção Psicossocial do SUS).</w:t>
+        <w:t xml:space="preserve">🟡 Regra geral. Base: CLT, art. 482, 'l' (prática constante de jogos de azar), 'e' (desídia) e 'h' (indisciplina); CID-11 da OMS (6C50, transtorno do jogo); TST sem entendimento consolidado sobre bets e ludopatia, segundo a imprensa (InfoMoney, Migalhas, Conjur). Ressalva: há debate se aposta regulamentada se enquadra como 'jogo de azar' e se a conduta fora do trabalho basta; o vídeo fala em 'dependendo do caso'. Atendimento pelo SUS: UBS, CAPS e teleatendimento pelo Meu SUS Digital, segundo o Ministério da Saúde.</w:t>
       </w:r>
     </w:p>
     <w:p>

</xml_diff>